<commit_message>
Pujiang plan (1008 docx): add cost summary table, update hardware/software prices to 800k, refresh diagrams
Co-Authored-By: Claude Sonnet 5.5 <noreply@anthropic.com>
Claude-Session: https://claude.ai/code/session_01DZcW8UzFAMq1wyGnVPG7By
</commit_message>
<xml_diff>
--- a/浦江/c-浦江网联试验室智能化提升项目（三期）建设方案 (1008).docx
+++ b/浦江/c-浦江网联试验室智能化提升项目（三期）建设方案 (1008).docx
@@ -1219,14 +1219,50 @@
               <w:tab w:val="right" w:leader="dot" w:pos="8305"/>
             </w:tabs>
           </w:pPr>
-          <w:hyperlink w:anchor="_Toc900125" w:history="1">
+          <w:hyperlink w:anchor="_Toc900200" w:history="1">
             <w:r>
               <w:rPr>
                 <w:rFonts w:ascii="SimSun" w:hAnsi="SimSun" w:cs="SimSun" w:hint="eastAsia"/>
                 <w:snapToGrid w:val="0"/>
                 <w:szCs w:val="28"/>
               </w:rPr>
-              <w:t>5.1 硬件报价清单</w:t>
+              <w:t>5.1 费用汇总</w:t>
+            </w:r>
+            <w:r>
+              <w:tab/>
+            </w:r>
+            <w:r>
+              <w:fldChar w:fldCharType="begin"/>
+            </w:r>
+            <w:r>
+              <w:instrText xml:space="preserve"> PAGEREF _Toc900200 \h </w:instrText>
+            </w:r>
+            <w:r>
+              <w:fldChar w:fldCharType="separate"/>
+            </w:r>
+            <w:r>
+              <w:t>15</w:t>
+            </w:r>
+            <w:r>
+              <w:fldChar w:fldCharType="end"/>
+            </w:r>
+          </w:hyperlink>
+        </w:p>
+        <w:p>
+          <w:pPr>
+            <w:pStyle w:val="TOC2"/>
+            <w:tabs>
+              <w:tab w:val="right" w:leader="dot" w:pos="8305"/>
+            </w:tabs>
+          </w:pPr>
+          <w:hyperlink w:anchor="_Toc900125" w:history="1">
+            <w:r>
+              <w:rPr>
+                <w:rFonts w:ascii="SimSun" w:hAnsi="SimSun" w:cs="SimSun" w:hint="eastAsia"/>
+                <w:snapToGrid w:val="0"/>
+                <w:szCs w:val="28"/>
+              </w:rPr>
+              <w:t>5.2 硬件报价清单</w:t>
             </w:r>
             <w:r>
               <w:tab/>
@@ -1262,7 +1298,7 @@
                 <w:snapToGrid w:val="0"/>
                 <w:szCs w:val="28"/>
               </w:rPr>
-              <w:t>5.2 软件报价清单</w:t>
+              <w:t>5.3 软件报价清单</w:t>
             </w:r>
             <w:r>
               <w:tab/>
@@ -1277,7 +1313,7 @@
               <w:fldChar w:fldCharType="separate"/>
             </w:r>
             <w:r>
-              <w:t>15</w:t>
+              <w:t>16</w:t>
             </w:r>
             <w:r>
               <w:fldChar w:fldCharType="end"/>
@@ -6647,7 +6683,7 @@
           <w:szCs w:val="28"/>
         </w:rPr>
       </w:pPr>
-      <w:bookmarkStart w:id="26" w:name="_Toc900125"/>
+      <w:bookmarkStart w:id="9001" w:name="_Toc900200"/>
       <w:r>
         <w:rPr>
           <w:rFonts w:ascii="SimSun" w:hAnsi="SimSun" w:cs="SimSun" w:hint="eastAsia"/>
@@ -6657,7 +6693,363 @@
           <w:sz w:val="28"/>
           <w:szCs w:val="28"/>
         </w:rPr>
-        <w:t>5.1 硬件报价清单</w:t>
+        <w:t>5.1 费用汇总</w:t>
+      </w:r>
+      <w:bookmarkEnd w:id="9001"/>
+    </w:p>
+    <w:tbl>
+      <w:tblPr>
+        <w:tblW w:w="8306" w:type="dxa"/>
+        <w:jc w:val="center"/>
+        <w:tblBorders>
+          <w:top w:val="single" w:sz="6" w:space="0" w:color="D9D9D9"/>
+          <w:left w:val="single" w:sz="6" w:space="0" w:color="D9D9D9"/>
+          <w:bottom w:val="single" w:sz="6" w:space="0" w:color="D9D9D9"/>
+          <w:right w:val="single" w:sz="6" w:space="0" w:color="D9D9D9"/>
+          <w:insideH w:val="single" w:sz="6" w:space="0" w:color="D9D9D9"/>
+          <w:insideV w:val="single" w:sz="6" w:space="0" w:color="D9D9D9"/>
+        </w:tblBorders>
+        <w:tblLayout w:type="fixed"/>
+        <w:tblLook w:val="04A0" w:firstRow="1" w:lastRow="0" w:firstColumn="1" w:lastColumn="0" w:noHBand="0" w:noVBand="1"/>
+      </w:tblPr>
+      <w:tblGrid>
+        <w:gridCol w:w="3986"/>
+        <w:gridCol w:w="4320"/>
+      </w:tblGrid>
+      <w:tr>
+        <w:trPr>
+          <w:cantSplit/>
+          <w:tblHeader/>
+          <w:jc w:val="center"/>
+        </w:trPr>
+        <w:tc>
+          <w:tcPr>
+            <w:tcW w:w="3986" w:type="dxa"/>
+            <w:shd w:val="clear" w:color="auto" w:fill="17365D"/>
+            <w:tcMar>
+              <w:top w:w="100" w:type="dxa"/>
+              <w:left w:w="60" w:type="dxa"/>
+              <w:bottom w:w="100" w:type="dxa"/>
+              <w:right w:w="60" w:type="dxa"/>
+            </w:tcMar>
+            <w:vAlign w:val="center"/>
+          </w:tcPr>
+          <w:p>
+            <w:pPr>
+              <w:spacing w:line="269" w:lineRule="auto"/>
+              <w:jc w:val="center"/>
+              <w:rPr>
+                <w:rFonts w:ascii="SimSun" w:hAnsi="SimSun" w:cs="SimSun"/>
+                <w:b/>
+                <w:color w:val="FFFFFF"/>
+                <w:sz w:val="18"/>
+                <w:szCs w:val="18"/>
+              </w:rPr>
+            </w:pPr>
+            <w:r>
+              <w:rPr>
+                <w:rFonts w:ascii="SimSun" w:hAnsi="SimSun" w:cs="SimSun" w:hint="eastAsia"/>
+                <w:b/>
+                <w:color w:val="FFFFFF"/>
+                <w:sz w:val="18"/>
+                <w:szCs w:val="18"/>
+              </w:rPr>
+              <w:t>项目</w:t>
+            </w:r>
+          </w:p>
+        </w:tc>
+        <w:tc>
+          <w:tcPr>
+            <w:tcW w:w="4320" w:type="dxa"/>
+            <w:shd w:val="clear" w:color="auto" w:fill="17365D"/>
+            <w:tcMar>
+              <w:top w:w="100" w:type="dxa"/>
+              <w:left w:w="60" w:type="dxa"/>
+              <w:bottom w:w="100" w:type="dxa"/>
+              <w:right w:w="60" w:type="dxa"/>
+            </w:tcMar>
+            <w:vAlign w:val="center"/>
+          </w:tcPr>
+          <w:p>
+            <w:pPr>
+              <w:spacing w:line="269" w:lineRule="auto"/>
+              <w:jc w:val="center"/>
+              <w:rPr>
+                <w:rFonts w:ascii="SimSun" w:hAnsi="SimSun" w:cs="SimSun"/>
+                <w:b/>
+                <w:color w:val="FFFFFF"/>
+                <w:sz w:val="18"/>
+                <w:szCs w:val="18"/>
+              </w:rPr>
+            </w:pPr>
+            <w:r>
+              <w:rPr>
+                <w:rFonts w:ascii="SimSun" w:hAnsi="SimSun" w:cs="SimSun" w:hint="eastAsia"/>
+                <w:b/>
+                <w:color w:val="FFFFFF"/>
+                <w:sz w:val="18"/>
+                <w:szCs w:val="18"/>
+              </w:rPr>
+              <w:t>金额（元）</w:t>
+            </w:r>
+          </w:p>
+        </w:tc>
+      </w:tr>
+      <w:tr>
+        <w:trPr>
+          <w:cantSplit/>
+          <w:jc w:val="center"/>
+        </w:trPr>
+        <w:tc>
+          <w:tcPr>
+            <w:tcW w:w="3986" w:type="dxa"/>
+            <w:tcMar>
+              <w:top w:w="100" w:type="dxa"/>
+              <w:left w:w="60" w:type="dxa"/>
+              <w:bottom w:w="100" w:type="dxa"/>
+              <w:right w:w="60" w:type="dxa"/>
+            </w:tcMar>
+            <w:vAlign w:val="center"/>
+          </w:tcPr>
+          <w:p>
+            <w:pPr>
+              <w:spacing w:line="269" w:lineRule="auto"/>
+              <w:jc w:val="center"/>
+              <w:rPr>
+                <w:rFonts w:ascii="SimSun" w:hAnsi="SimSun" w:cs="SimSun"/>
+                <w:color w:val="000000"/>
+                <w:sz w:val="18"/>
+                <w:szCs w:val="18"/>
+              </w:rPr>
+            </w:pPr>
+            <w:r>
+              <w:rPr>
+                <w:rFonts w:ascii="SimSun" w:hAnsi="SimSun" w:cs="SimSun" w:hint="eastAsia"/>
+                <w:color w:val="000000"/>
+                <w:sz w:val="18"/>
+                <w:szCs w:val="18"/>
+              </w:rPr>
+              <w:t>硬件总价</w:t>
+            </w:r>
+          </w:p>
+        </w:tc>
+        <w:tc>
+          <w:tcPr>
+            <w:tcW w:w="4320" w:type="dxa"/>
+            <w:tcMar>
+              <w:top w:w="100" w:type="dxa"/>
+              <w:left w:w="60" w:type="dxa"/>
+              <w:bottom w:w="100" w:type="dxa"/>
+              <w:right w:w="60" w:type="dxa"/>
+            </w:tcMar>
+            <w:vAlign w:val="center"/>
+          </w:tcPr>
+          <w:p>
+            <w:pPr>
+              <w:spacing w:line="269" w:lineRule="auto"/>
+              <w:jc w:val="left"/>
+              <w:rPr>
+                <w:rFonts w:ascii="SimSun" w:hAnsi="SimSun" w:cs="SimSun"/>
+                <w:color w:val="000000"/>
+                <w:sz w:val="18"/>
+                <w:szCs w:val="18"/>
+              </w:rPr>
+            </w:pPr>
+            <w:r>
+              <w:rPr>
+                <w:rFonts w:ascii="SimSun" w:hAnsi="SimSun" w:cs="SimSun" w:hint="eastAsia"/>
+                <w:color w:val="000000"/>
+                <w:sz w:val="18"/>
+                <w:szCs w:val="18"/>
+              </w:rPr>
+              <w:t>284,000</w:t>
+            </w:r>
+          </w:p>
+        </w:tc>
+      </w:tr>
+      <w:tr>
+        <w:trPr>
+          <w:cantSplit/>
+          <w:jc w:val="center"/>
+        </w:trPr>
+        <w:tc>
+          <w:tcPr>
+            <w:tcW w:w="3986" w:type="dxa"/>
+            <w:tcMar>
+              <w:top w:w="100" w:type="dxa"/>
+              <w:left w:w="60" w:type="dxa"/>
+              <w:bottom w:w="100" w:type="dxa"/>
+              <w:right w:w="60" w:type="dxa"/>
+            </w:tcMar>
+            <w:vAlign w:val="center"/>
+          </w:tcPr>
+          <w:p>
+            <w:pPr>
+              <w:spacing w:line="269" w:lineRule="auto"/>
+              <w:jc w:val="center"/>
+              <w:rPr>
+                <w:rFonts w:ascii="SimSun" w:hAnsi="SimSun" w:cs="SimSun"/>
+                <w:color w:val="000000"/>
+                <w:sz w:val="18"/>
+                <w:szCs w:val="18"/>
+              </w:rPr>
+            </w:pPr>
+            <w:r>
+              <w:rPr>
+                <w:rFonts w:ascii="SimSun" w:hAnsi="SimSun" w:cs="SimSun" w:hint="eastAsia"/>
+                <w:color w:val="000000"/>
+                <w:sz w:val="18"/>
+                <w:szCs w:val="18"/>
+              </w:rPr>
+              <w:t>软件总价</w:t>
+            </w:r>
+          </w:p>
+        </w:tc>
+        <w:tc>
+          <w:tcPr>
+            <w:tcW w:w="4320" w:type="dxa"/>
+            <w:tcMar>
+              <w:top w:w="100" w:type="dxa"/>
+              <w:left w:w="60" w:type="dxa"/>
+              <w:bottom w:w="100" w:type="dxa"/>
+              <w:right w:w="60" w:type="dxa"/>
+            </w:tcMar>
+            <w:vAlign w:val="center"/>
+          </w:tcPr>
+          <w:p>
+            <w:pPr>
+              <w:spacing w:line="269" w:lineRule="auto"/>
+              <w:jc w:val="left"/>
+              <w:rPr>
+                <w:rFonts w:ascii="SimSun" w:hAnsi="SimSun" w:cs="SimSun"/>
+                <w:color w:val="000000"/>
+                <w:sz w:val="18"/>
+                <w:szCs w:val="18"/>
+              </w:rPr>
+            </w:pPr>
+            <w:r>
+              <w:rPr>
+                <w:rFonts w:ascii="SimSun" w:hAnsi="SimSun" w:cs="SimSun" w:hint="eastAsia"/>
+                <w:color w:val="000000"/>
+                <w:sz w:val="18"/>
+                <w:szCs w:val="18"/>
+              </w:rPr>
+              <w:t>516,000</w:t>
+            </w:r>
+          </w:p>
+        </w:tc>
+      </w:tr>
+      <w:tr>
+        <w:trPr>
+          <w:cantSplit/>
+          <w:jc w:val="center"/>
+        </w:trPr>
+        <w:tc>
+          <w:tcPr>
+            <w:tcW w:w="3986" w:type="dxa"/>
+            <w:tcMar>
+              <w:top w:w="100" w:type="dxa"/>
+              <w:left w:w="60" w:type="dxa"/>
+              <w:bottom w:w="100" w:type="dxa"/>
+              <w:right w:w="60" w:type="dxa"/>
+            </w:tcMar>
+            <w:vAlign w:val="center"/>
+          </w:tcPr>
+          <w:p>
+            <w:pPr>
+              <w:spacing w:line="269" w:lineRule="auto"/>
+              <w:jc w:val="center"/>
+              <w:rPr>
+                <w:rFonts w:ascii="SimSun" w:hAnsi="SimSun" w:cs="SimSun"/>
+                <w:color w:val="000000"/>
+                <w:sz w:val="18"/>
+                <w:szCs w:val="18"/>
+              </w:rPr>
+            </w:pPr>
+            <w:r>
+              <w:rPr>
+                <w:rFonts w:ascii="SimSun" w:hAnsi="SimSun" w:cs="SimSun" w:hint="eastAsia"/>
+                <w:color w:val="000000"/>
+                <w:sz w:val="18"/>
+                <w:szCs w:val="18"/>
+              </w:rPr>
+              <w:t>合计</w:t>
+            </w:r>
+          </w:p>
+        </w:tc>
+        <w:tc>
+          <w:tcPr>
+            <w:tcW w:w="4320" w:type="dxa"/>
+            <w:tcMar>
+              <w:top w:w="100" w:type="dxa"/>
+              <w:left w:w="60" w:type="dxa"/>
+              <w:bottom w:w="100" w:type="dxa"/>
+              <w:right w:w="60" w:type="dxa"/>
+            </w:tcMar>
+            <w:vAlign w:val="center"/>
+          </w:tcPr>
+          <w:p>
+            <w:pPr>
+              <w:spacing w:line="269" w:lineRule="auto"/>
+              <w:jc w:val="left"/>
+              <w:rPr>
+                <w:rFonts w:ascii="SimSun" w:hAnsi="SimSun" w:cs="SimSun"/>
+                <w:color w:val="000000"/>
+                <w:sz w:val="18"/>
+                <w:szCs w:val="18"/>
+              </w:rPr>
+            </w:pPr>
+            <w:r>
+              <w:rPr>
+                <w:rFonts w:ascii="SimSun" w:hAnsi="SimSun" w:cs="SimSun" w:hint="eastAsia"/>
+                <w:color w:val="000000"/>
+                <w:sz w:val="18"/>
+                <w:szCs w:val="18"/>
+              </w:rPr>
+              <w:t>800,000</w:t>
+            </w:r>
+          </w:p>
+        </w:tc>
+      </w:tr>
+    </w:tbl>
+    <w:p>
+      <w:pPr>
+        <w:pStyle w:val="2"/>
+      </w:pPr>
+    </w:p>
+    <w:p>
+      <w:pPr>
+        <w:keepNext/>
+        <w:widowControl/>
+        <w:kinsoku w:val="0"/>
+        <w:autoSpaceDE w:val="0"/>
+        <w:autoSpaceDN w:val="0"/>
+        <w:adjustRightInd w:val="0"/>
+        <w:snapToGrid w:val="0"/>
+        <w:spacing w:before="120" w:line="360" w:lineRule="auto"/>
+        <w:jc w:val="left"/>
+        <w:textAlignment w:val="baseline"/>
+        <w:outlineLvl w:val="1"/>
+        <w:rPr>
+          <w:rFonts w:ascii="SimSun" w:hAnsi="SimSun" w:cs="SimSun"/>
+          <w:b/>
+          <w:snapToGrid w:val="0"/>
+          <w:color w:val="000000"/>
+          <w:sz w:val="28"/>
+          <w:szCs w:val="28"/>
+        </w:rPr>
+      </w:pPr>
+      <w:bookmarkStart w:id="26" w:name="_Toc900125"/>
+      <w:r>
+        <w:rPr>
+          <w:rFonts w:ascii="SimSun" w:hAnsi="SimSun" w:cs="SimSun" w:hint="eastAsia"/>
+          <w:b/>
+          <w:snapToGrid w:val="0"/>
+          <w:color w:val="000000"/>
+          <w:sz w:val="28"/>
+          <w:szCs w:val="28"/>
+        </w:rPr>
+        <w:t>5.2 硬件报价清单</w:t>
       </w:r>
       <w:bookmarkEnd w:id="26"/>
     </w:p>
@@ -7151,7 +7543,7 @@
                 <w:sz w:val="18"/>
                 <w:szCs w:val="18"/>
               </w:rPr>
-              <w:t>X300B工业搬运机器人，含电池、自动回充桩、调度管理系统授权及现场建图调试</w:t>
+              <w:t>X300B工业搬运机器人，双轮差速驱动，激光SLAM导航，举升高度60 mm，导航到点精度&lt;±20 mm；含电池、自动回充桩、调度管理系统授权及现场建图调试</w:t>
             </w:r>
           </w:p>
         </w:tc>
@@ -7422,7 +7814,7 @@
                 <w:sz w:val="18"/>
                 <w:szCs w:val="18"/>
               </w:rPr>
-              <w:t>运输机器人联动改造</w:t>
+              <w:t>运输机器人联动开门设备</w:t>
             </w:r>
           </w:p>
         </w:tc>
@@ -7455,7 +7847,7 @@
                 <w:sz w:val="18"/>
                 <w:szCs w:val="18"/>
               </w:rPr>
-              <w:t>运输路线试验室门体加装联动控制器与电动开门机</w:t>
+              <w:t>运输路线上试验室门体的联网开门设备，含电动开门机、联网门控控制器（以太网接口，接收调度系统开门指令）、开门到位信号反馈及安装调试</w:t>
             </w:r>
           </w:p>
         </w:tc>
@@ -7554,16 +7946,7 @@
                 <w:sz w:val="18"/>
                 <w:szCs w:val="18"/>
               </w:rPr>
-              <w:t>8</w:t>
-            </w:r>
-            <w:r>
-              <w:rPr>
-                <w:rFonts w:ascii="SimSun" w:hAnsi="SimSun" w:cs="SimSun" w:hint="eastAsia"/>
-                <w:color w:val="000000"/>
-                <w:sz w:val="18"/>
-                <w:szCs w:val="18"/>
-              </w:rPr>
-              <w:t>,000</w:t>
+              <w:t>8,000</w:t>
             </w:r>
           </w:p>
         </w:tc>
@@ -7596,16 +7979,7 @@
                 <w:sz w:val="18"/>
                 <w:szCs w:val="18"/>
               </w:rPr>
-              <w:t>32</w:t>
-            </w:r>
-            <w:r>
-              <w:rPr>
-                <w:rFonts w:ascii="SimSun" w:hAnsi="SimSun" w:cs="SimSun" w:hint="eastAsia"/>
-                <w:color w:val="000000"/>
-                <w:sz w:val="18"/>
-                <w:szCs w:val="18"/>
-              </w:rPr>
-              <w:t>,000</w:t>
+              <w:t>64,000</w:t>
             </w:r>
           </w:p>
         </w:tc>
@@ -7631,6 +8005,9 @@
                 <w:szCs w:val="18"/>
               </w:rPr>
             </w:pPr>
+            <w:r>
+              <w:t>含安装调试；门型与尺寸以现场勘察为准</w:t>
+            </w:r>
           </w:p>
         </w:tc>
       </w:tr>
@@ -7768,7 +8145,7 @@
                 <w:sz w:val="18"/>
                 <w:szCs w:val="18"/>
               </w:rPr>
-              <w:t>55英寸商用显示屏，含支架与安装</w:t>
+              <w:t>55英寸商用显示屏，用于滚动展示当日及次日试验任务</w:t>
             </w:r>
           </w:p>
         </w:tc>
@@ -7926,6 +8303,9 @@
                 <w:szCs w:val="18"/>
               </w:rPr>
             </w:pPr>
+            <w:r>
+              <w:t>含支架与安装</w:t>
+            </w:r>
           </w:p>
         </w:tc>
       </w:tr>
@@ -8029,25 +8409,7 @@
                 <w:sz w:val="18"/>
                 <w:szCs w:val="18"/>
               </w:rPr>
-              <w:t>采集</w:t>
-            </w:r>
-            <w:r>
-              <w:rPr>
-                <w:rFonts w:ascii="SimSun" w:hAnsi="SimSun" w:cs="SimSun" w:hint="eastAsia"/>
-                <w:color w:val="000000"/>
-                <w:sz w:val="18"/>
-                <w:szCs w:val="18"/>
-              </w:rPr>
-              <w:t>设备</w:t>
-            </w:r>
-            <w:r>
-              <w:rPr>
-                <w:rFonts w:ascii="SimSun" w:hAnsi="SimSun" w:cs="SimSun" w:hint="eastAsia"/>
-                <w:color w:val="000000"/>
-                <w:sz w:val="18"/>
-                <w:szCs w:val="18"/>
-              </w:rPr>
-              <w:t>与安装</w:t>
+              <w:t>边缘采集网关</w:t>
             </w:r>
           </w:p>
         </w:tc>
@@ -8080,34 +8442,7 @@
                 <w:sz w:val="18"/>
                 <w:szCs w:val="18"/>
               </w:rPr>
-              <w:t>安装</w:t>
-            </w:r>
-            <w:r>
-              <w:rPr>
-                <w:rFonts w:ascii="SimSun" w:hAnsi="SimSun" w:cs="SimSun" w:hint="eastAsia"/>
-                <w:color w:val="000000"/>
-                <w:sz w:val="18"/>
-                <w:szCs w:val="18"/>
-              </w:rPr>
-              <w:t>采集试验设备</w:t>
-            </w:r>
-            <w:r>
-              <w:rPr>
-                <w:rFonts w:ascii="SimSun" w:hAnsi="SimSun" w:cs="SimSun" w:hint="eastAsia"/>
-                <w:color w:val="000000"/>
-                <w:sz w:val="18"/>
-                <w:szCs w:val="18"/>
-              </w:rPr>
-              <w:t>与采集程序用于数据</w:t>
-            </w:r>
-            <w:r>
-              <w:rPr>
-                <w:rFonts w:ascii="SimSun" w:hAnsi="SimSun" w:cs="SimSun" w:hint="eastAsia"/>
-                <w:color w:val="000000"/>
-                <w:sz w:val="18"/>
-                <w:szCs w:val="18"/>
-              </w:rPr>
-              <w:t>通信</w:t>
+              <w:t>支持RS232/RS485串口与以太网接口，用于采集试验设备通信数据</w:t>
             </w:r>
           </w:p>
         </w:tc>
@@ -8173,7 +8508,7 @@
                 <w:sz w:val="18"/>
                 <w:szCs w:val="18"/>
               </w:rPr>
-              <w:t>8</w:t>
+              <w:t>4</w:t>
             </w:r>
           </w:p>
         </w:tc>
@@ -8206,16 +8541,7 @@
                 <w:sz w:val="18"/>
                 <w:szCs w:val="18"/>
               </w:rPr>
-              <w:t>5</w:t>
-            </w:r>
-            <w:r>
-              <w:rPr>
-                <w:rFonts w:ascii="SimSun" w:hAnsi="SimSun" w:cs="SimSun" w:hint="eastAsia"/>
-                <w:color w:val="000000"/>
-                <w:sz w:val="18"/>
-                <w:szCs w:val="18"/>
-              </w:rPr>
-              <w:t>,000</w:t>
+              <w:t>3,000</w:t>
             </w:r>
           </w:p>
         </w:tc>
@@ -8346,6 +8672,7 @@
                 <w:szCs w:val="18"/>
               </w:rPr>
             </w:pPr>
+            <w:r/>
           </w:p>
         </w:tc>
         <w:tc>
@@ -8370,6 +8697,7 @@
                 <w:szCs w:val="18"/>
               </w:rPr>
             </w:pPr>
+            <w:r/>
           </w:p>
         </w:tc>
         <w:tc>
@@ -8394,6 +8722,7 @@
                 <w:szCs w:val="18"/>
               </w:rPr>
             </w:pPr>
+            <w:r/>
           </w:p>
         </w:tc>
         <w:tc>
@@ -8418,6 +8747,7 @@
                 <w:szCs w:val="18"/>
               </w:rPr>
             </w:pPr>
+            <w:r/>
           </w:p>
         </w:tc>
         <w:tc>
@@ -8442,6 +8772,7 @@
                 <w:szCs w:val="18"/>
               </w:rPr>
             </w:pPr>
+            <w:r/>
           </w:p>
         </w:tc>
         <w:tc>
@@ -8466,6 +8797,7 @@
                 <w:szCs w:val="18"/>
               </w:rPr>
             </w:pPr>
+            <w:r/>
           </w:p>
         </w:tc>
         <w:tc>
@@ -8497,7 +8829,7 @@
                 <w:sz w:val="18"/>
                 <w:szCs w:val="18"/>
               </w:rPr>
-              <w:t>244,000</w:t>
+              <w:t>284,000</w:t>
             </w:r>
           </w:p>
         </w:tc>
@@ -8523,6 +8855,7 @@
                 <w:szCs w:val="18"/>
               </w:rPr>
             </w:pPr>
+            <w:r/>
           </w:p>
         </w:tc>
       </w:tr>
@@ -8572,7 +8905,7 @@
           <w:sz w:val="28"/>
           <w:szCs w:val="28"/>
         </w:rPr>
-        <w:t>5.2 软件报价清单</w:t>
+        <w:t>5.3 软件报价清单</w:t>
       </w:r>
       <w:bookmarkEnd w:id="28"/>
     </w:p>
@@ -9165,7 +9498,7 @@
                 <w:sz w:val="18"/>
                 <w:szCs w:val="18"/>
               </w:rPr>
-              <w:t>100,000</w:t>
+              <w:t>95,000</w:t>
             </w:r>
           </w:p>
         </w:tc>
@@ -9198,7 +9531,7 @@
                 <w:sz w:val="18"/>
                 <w:szCs w:val="18"/>
               </w:rPr>
-              <w:t>100,000</w:t>
+              <w:t>95,000</w:t>
             </w:r>
           </w:p>
         </w:tc>
@@ -9459,7 +9792,7 @@
                 <w:sz w:val="18"/>
                 <w:szCs w:val="18"/>
               </w:rPr>
-              <w:t>35,000</w:t>
+              <w:t>40,000</w:t>
             </w:r>
           </w:p>
         </w:tc>
@@ -9492,7 +9825,7 @@
                 <w:sz w:val="18"/>
                 <w:szCs w:val="18"/>
               </w:rPr>
-              <w:t>35,000</w:t>
+              <w:t>40,000</w:t>
             </w:r>
           </w:p>
         </w:tc>
@@ -9753,7 +10086,7 @@
                 <w:sz w:val="18"/>
                 <w:szCs w:val="18"/>
               </w:rPr>
-              <w:t>125,000</w:t>
+              <w:t>110,000</w:t>
             </w:r>
           </w:p>
         </w:tc>
@@ -9786,7 +10119,7 @@
                 <w:sz w:val="18"/>
                 <w:szCs w:val="18"/>
               </w:rPr>
-              <w:t>125,000</w:t>
+              <w:t>110,000</w:t>
             </w:r>
           </w:p>
         </w:tc>
@@ -10048,7 +10381,7 @@
                 <w:sz w:val="18"/>
                 <w:szCs w:val="18"/>
               </w:rPr>
-              <w:t>175,000</w:t>
+              <w:t>165,000</w:t>
             </w:r>
           </w:p>
         </w:tc>
@@ -10081,7 +10414,7 @@
                 <w:sz w:val="18"/>
                 <w:szCs w:val="18"/>
               </w:rPr>
-              <w:t>175,000</w:t>
+              <w:t>165,000</w:t>
             </w:r>
           </w:p>
         </w:tc>
@@ -10342,7 +10675,7 @@
                 <w:sz w:val="18"/>
                 <w:szCs w:val="18"/>
               </w:rPr>
-              <w:t>61,000</w:t>
+              <w:t>46,000</w:t>
             </w:r>
           </w:p>
         </w:tc>
@@ -10375,7 +10708,7 @@
                 <w:sz w:val="18"/>
                 <w:szCs w:val="18"/>
               </w:rPr>
-              <w:t>61,000</w:t>
+              <w:t>46,000</w:t>
             </w:r>
           </w:p>
         </w:tc>
@@ -11203,7 +11536,7 @@
                 <w:sz w:val="18"/>
                 <w:szCs w:val="18"/>
               </w:rPr>
-              <w:t>556,000</w:t>
+              <w:t>516,000</w:t>
             </w:r>
           </w:p>
         </w:tc>

</xml_diff>

<commit_message>
Revert my edits to the 1008 plan docx; restore the user's uploaded version
Co-Authored-By: Claude Sonnet 5.5 <noreply@anthropic.com>
Claude-Session: https://claude.ai/code/session_01DZcW8UzFAMq1wyGnVPG7By
</commit_message>
<xml_diff>
--- a/浦江/c-浦江网联试验室智能化提升项目（三期）建设方案 (1008).docx
+++ b/浦江/c-浦江网联试验室智能化提升项目（三期）建设方案 (1008).docx
@@ -1219,50 +1219,14 @@
               <w:tab w:val="right" w:leader="dot" w:pos="8305"/>
             </w:tabs>
           </w:pPr>
-          <w:hyperlink w:anchor="_Toc900200" w:history="1">
+          <w:hyperlink w:anchor="_Toc900125" w:history="1">
             <w:r>
               <w:rPr>
                 <w:rFonts w:ascii="SimSun" w:hAnsi="SimSun" w:cs="SimSun" w:hint="eastAsia"/>
                 <w:snapToGrid w:val="0"/>
                 <w:szCs w:val="28"/>
               </w:rPr>
-              <w:t>5.1 费用汇总</w:t>
-            </w:r>
-            <w:r>
-              <w:tab/>
-            </w:r>
-            <w:r>
-              <w:fldChar w:fldCharType="begin"/>
-            </w:r>
-            <w:r>
-              <w:instrText xml:space="preserve"> PAGEREF _Toc900200 \h </w:instrText>
-            </w:r>
-            <w:r>
-              <w:fldChar w:fldCharType="separate"/>
-            </w:r>
-            <w:r>
-              <w:t>15</w:t>
-            </w:r>
-            <w:r>
-              <w:fldChar w:fldCharType="end"/>
-            </w:r>
-          </w:hyperlink>
-        </w:p>
-        <w:p>
-          <w:pPr>
-            <w:pStyle w:val="TOC2"/>
-            <w:tabs>
-              <w:tab w:val="right" w:leader="dot" w:pos="8305"/>
-            </w:tabs>
-          </w:pPr>
-          <w:hyperlink w:anchor="_Toc900125" w:history="1">
-            <w:r>
-              <w:rPr>
-                <w:rFonts w:ascii="SimSun" w:hAnsi="SimSun" w:cs="SimSun" w:hint="eastAsia"/>
-                <w:snapToGrid w:val="0"/>
-                <w:szCs w:val="28"/>
-              </w:rPr>
-              <w:t>5.2 硬件报价清单</w:t>
+              <w:t>5.1 硬件报价清单</w:t>
             </w:r>
             <w:r>
               <w:tab/>
@@ -1298,7 +1262,7 @@
                 <w:snapToGrid w:val="0"/>
                 <w:szCs w:val="28"/>
               </w:rPr>
-              <w:t>5.3 软件报价清单</w:t>
+              <w:t>5.2 软件报价清单</w:t>
             </w:r>
             <w:r>
               <w:tab/>
@@ -1313,7 +1277,7 @@
               <w:fldChar w:fldCharType="separate"/>
             </w:r>
             <w:r>
-              <w:t>16</w:t>
+              <w:t>15</w:t>
             </w:r>
             <w:r>
               <w:fldChar w:fldCharType="end"/>
@@ -6683,7 +6647,7 @@
           <w:szCs w:val="28"/>
         </w:rPr>
       </w:pPr>
-      <w:bookmarkStart w:id="9001" w:name="_Toc900200"/>
+      <w:bookmarkStart w:id="26" w:name="_Toc900125"/>
       <w:r>
         <w:rPr>
           <w:rFonts w:ascii="SimSun" w:hAnsi="SimSun" w:cs="SimSun" w:hint="eastAsia"/>
@@ -6693,363 +6657,7 @@
           <w:sz w:val="28"/>
           <w:szCs w:val="28"/>
         </w:rPr>
-        <w:t>5.1 费用汇总</w:t>
-      </w:r>
-      <w:bookmarkEnd w:id="9001"/>
-    </w:p>
-    <w:tbl>
-      <w:tblPr>
-        <w:tblW w:w="8306" w:type="dxa"/>
-        <w:jc w:val="center"/>
-        <w:tblBorders>
-          <w:top w:val="single" w:sz="6" w:space="0" w:color="D9D9D9"/>
-          <w:left w:val="single" w:sz="6" w:space="0" w:color="D9D9D9"/>
-          <w:bottom w:val="single" w:sz="6" w:space="0" w:color="D9D9D9"/>
-          <w:right w:val="single" w:sz="6" w:space="0" w:color="D9D9D9"/>
-          <w:insideH w:val="single" w:sz="6" w:space="0" w:color="D9D9D9"/>
-          <w:insideV w:val="single" w:sz="6" w:space="0" w:color="D9D9D9"/>
-        </w:tblBorders>
-        <w:tblLayout w:type="fixed"/>
-        <w:tblLook w:val="04A0" w:firstRow="1" w:lastRow="0" w:firstColumn="1" w:lastColumn="0" w:noHBand="0" w:noVBand="1"/>
-      </w:tblPr>
-      <w:tblGrid>
-        <w:gridCol w:w="3986"/>
-        <w:gridCol w:w="4320"/>
-      </w:tblGrid>
-      <w:tr>
-        <w:trPr>
-          <w:cantSplit/>
-          <w:tblHeader/>
-          <w:jc w:val="center"/>
-        </w:trPr>
-        <w:tc>
-          <w:tcPr>
-            <w:tcW w:w="3986" w:type="dxa"/>
-            <w:shd w:val="clear" w:color="auto" w:fill="17365D"/>
-            <w:tcMar>
-              <w:top w:w="100" w:type="dxa"/>
-              <w:left w:w="60" w:type="dxa"/>
-              <w:bottom w:w="100" w:type="dxa"/>
-              <w:right w:w="60" w:type="dxa"/>
-            </w:tcMar>
-            <w:vAlign w:val="center"/>
-          </w:tcPr>
-          <w:p>
-            <w:pPr>
-              <w:spacing w:line="269" w:lineRule="auto"/>
-              <w:jc w:val="center"/>
-              <w:rPr>
-                <w:rFonts w:ascii="SimSun" w:hAnsi="SimSun" w:cs="SimSun"/>
-                <w:b/>
-                <w:color w:val="FFFFFF"/>
-                <w:sz w:val="18"/>
-                <w:szCs w:val="18"/>
-              </w:rPr>
-            </w:pPr>
-            <w:r>
-              <w:rPr>
-                <w:rFonts w:ascii="SimSun" w:hAnsi="SimSun" w:cs="SimSun" w:hint="eastAsia"/>
-                <w:b/>
-                <w:color w:val="FFFFFF"/>
-                <w:sz w:val="18"/>
-                <w:szCs w:val="18"/>
-              </w:rPr>
-              <w:t>项目</w:t>
-            </w:r>
-          </w:p>
-        </w:tc>
-        <w:tc>
-          <w:tcPr>
-            <w:tcW w:w="4320" w:type="dxa"/>
-            <w:shd w:val="clear" w:color="auto" w:fill="17365D"/>
-            <w:tcMar>
-              <w:top w:w="100" w:type="dxa"/>
-              <w:left w:w="60" w:type="dxa"/>
-              <w:bottom w:w="100" w:type="dxa"/>
-              <w:right w:w="60" w:type="dxa"/>
-            </w:tcMar>
-            <w:vAlign w:val="center"/>
-          </w:tcPr>
-          <w:p>
-            <w:pPr>
-              <w:spacing w:line="269" w:lineRule="auto"/>
-              <w:jc w:val="center"/>
-              <w:rPr>
-                <w:rFonts w:ascii="SimSun" w:hAnsi="SimSun" w:cs="SimSun"/>
-                <w:b/>
-                <w:color w:val="FFFFFF"/>
-                <w:sz w:val="18"/>
-                <w:szCs w:val="18"/>
-              </w:rPr>
-            </w:pPr>
-            <w:r>
-              <w:rPr>
-                <w:rFonts w:ascii="SimSun" w:hAnsi="SimSun" w:cs="SimSun" w:hint="eastAsia"/>
-                <w:b/>
-                <w:color w:val="FFFFFF"/>
-                <w:sz w:val="18"/>
-                <w:szCs w:val="18"/>
-              </w:rPr>
-              <w:t>金额（元）</w:t>
-            </w:r>
-          </w:p>
-        </w:tc>
-      </w:tr>
-      <w:tr>
-        <w:trPr>
-          <w:cantSplit/>
-          <w:jc w:val="center"/>
-        </w:trPr>
-        <w:tc>
-          <w:tcPr>
-            <w:tcW w:w="3986" w:type="dxa"/>
-            <w:tcMar>
-              <w:top w:w="100" w:type="dxa"/>
-              <w:left w:w="60" w:type="dxa"/>
-              <w:bottom w:w="100" w:type="dxa"/>
-              <w:right w:w="60" w:type="dxa"/>
-            </w:tcMar>
-            <w:vAlign w:val="center"/>
-          </w:tcPr>
-          <w:p>
-            <w:pPr>
-              <w:spacing w:line="269" w:lineRule="auto"/>
-              <w:jc w:val="center"/>
-              <w:rPr>
-                <w:rFonts w:ascii="SimSun" w:hAnsi="SimSun" w:cs="SimSun"/>
-                <w:color w:val="000000"/>
-                <w:sz w:val="18"/>
-                <w:szCs w:val="18"/>
-              </w:rPr>
-            </w:pPr>
-            <w:r>
-              <w:rPr>
-                <w:rFonts w:ascii="SimSun" w:hAnsi="SimSun" w:cs="SimSun" w:hint="eastAsia"/>
-                <w:color w:val="000000"/>
-                <w:sz w:val="18"/>
-                <w:szCs w:val="18"/>
-              </w:rPr>
-              <w:t>硬件总价</w:t>
-            </w:r>
-          </w:p>
-        </w:tc>
-        <w:tc>
-          <w:tcPr>
-            <w:tcW w:w="4320" w:type="dxa"/>
-            <w:tcMar>
-              <w:top w:w="100" w:type="dxa"/>
-              <w:left w:w="60" w:type="dxa"/>
-              <w:bottom w:w="100" w:type="dxa"/>
-              <w:right w:w="60" w:type="dxa"/>
-            </w:tcMar>
-            <w:vAlign w:val="center"/>
-          </w:tcPr>
-          <w:p>
-            <w:pPr>
-              <w:spacing w:line="269" w:lineRule="auto"/>
-              <w:jc w:val="left"/>
-              <w:rPr>
-                <w:rFonts w:ascii="SimSun" w:hAnsi="SimSun" w:cs="SimSun"/>
-                <w:color w:val="000000"/>
-                <w:sz w:val="18"/>
-                <w:szCs w:val="18"/>
-              </w:rPr>
-            </w:pPr>
-            <w:r>
-              <w:rPr>
-                <w:rFonts w:ascii="SimSun" w:hAnsi="SimSun" w:cs="SimSun" w:hint="eastAsia"/>
-                <w:color w:val="000000"/>
-                <w:sz w:val="18"/>
-                <w:szCs w:val="18"/>
-              </w:rPr>
-              <w:t>284,000</w:t>
-            </w:r>
-          </w:p>
-        </w:tc>
-      </w:tr>
-      <w:tr>
-        <w:trPr>
-          <w:cantSplit/>
-          <w:jc w:val="center"/>
-        </w:trPr>
-        <w:tc>
-          <w:tcPr>
-            <w:tcW w:w="3986" w:type="dxa"/>
-            <w:tcMar>
-              <w:top w:w="100" w:type="dxa"/>
-              <w:left w:w="60" w:type="dxa"/>
-              <w:bottom w:w="100" w:type="dxa"/>
-              <w:right w:w="60" w:type="dxa"/>
-            </w:tcMar>
-            <w:vAlign w:val="center"/>
-          </w:tcPr>
-          <w:p>
-            <w:pPr>
-              <w:spacing w:line="269" w:lineRule="auto"/>
-              <w:jc w:val="center"/>
-              <w:rPr>
-                <w:rFonts w:ascii="SimSun" w:hAnsi="SimSun" w:cs="SimSun"/>
-                <w:color w:val="000000"/>
-                <w:sz w:val="18"/>
-                <w:szCs w:val="18"/>
-              </w:rPr>
-            </w:pPr>
-            <w:r>
-              <w:rPr>
-                <w:rFonts w:ascii="SimSun" w:hAnsi="SimSun" w:cs="SimSun" w:hint="eastAsia"/>
-                <w:color w:val="000000"/>
-                <w:sz w:val="18"/>
-                <w:szCs w:val="18"/>
-              </w:rPr>
-              <w:t>软件总价</w:t>
-            </w:r>
-          </w:p>
-        </w:tc>
-        <w:tc>
-          <w:tcPr>
-            <w:tcW w:w="4320" w:type="dxa"/>
-            <w:tcMar>
-              <w:top w:w="100" w:type="dxa"/>
-              <w:left w:w="60" w:type="dxa"/>
-              <w:bottom w:w="100" w:type="dxa"/>
-              <w:right w:w="60" w:type="dxa"/>
-            </w:tcMar>
-            <w:vAlign w:val="center"/>
-          </w:tcPr>
-          <w:p>
-            <w:pPr>
-              <w:spacing w:line="269" w:lineRule="auto"/>
-              <w:jc w:val="left"/>
-              <w:rPr>
-                <w:rFonts w:ascii="SimSun" w:hAnsi="SimSun" w:cs="SimSun"/>
-                <w:color w:val="000000"/>
-                <w:sz w:val="18"/>
-                <w:szCs w:val="18"/>
-              </w:rPr>
-            </w:pPr>
-            <w:r>
-              <w:rPr>
-                <w:rFonts w:ascii="SimSun" w:hAnsi="SimSun" w:cs="SimSun" w:hint="eastAsia"/>
-                <w:color w:val="000000"/>
-                <w:sz w:val="18"/>
-                <w:szCs w:val="18"/>
-              </w:rPr>
-              <w:t>516,000</w:t>
-            </w:r>
-          </w:p>
-        </w:tc>
-      </w:tr>
-      <w:tr>
-        <w:trPr>
-          <w:cantSplit/>
-          <w:jc w:val="center"/>
-        </w:trPr>
-        <w:tc>
-          <w:tcPr>
-            <w:tcW w:w="3986" w:type="dxa"/>
-            <w:tcMar>
-              <w:top w:w="100" w:type="dxa"/>
-              <w:left w:w="60" w:type="dxa"/>
-              <w:bottom w:w="100" w:type="dxa"/>
-              <w:right w:w="60" w:type="dxa"/>
-            </w:tcMar>
-            <w:vAlign w:val="center"/>
-          </w:tcPr>
-          <w:p>
-            <w:pPr>
-              <w:spacing w:line="269" w:lineRule="auto"/>
-              <w:jc w:val="center"/>
-              <w:rPr>
-                <w:rFonts w:ascii="SimSun" w:hAnsi="SimSun" w:cs="SimSun"/>
-                <w:color w:val="000000"/>
-                <w:sz w:val="18"/>
-                <w:szCs w:val="18"/>
-              </w:rPr>
-            </w:pPr>
-            <w:r>
-              <w:rPr>
-                <w:rFonts w:ascii="SimSun" w:hAnsi="SimSun" w:cs="SimSun" w:hint="eastAsia"/>
-                <w:color w:val="000000"/>
-                <w:sz w:val="18"/>
-                <w:szCs w:val="18"/>
-              </w:rPr>
-              <w:t>合计</w:t>
-            </w:r>
-          </w:p>
-        </w:tc>
-        <w:tc>
-          <w:tcPr>
-            <w:tcW w:w="4320" w:type="dxa"/>
-            <w:tcMar>
-              <w:top w:w="100" w:type="dxa"/>
-              <w:left w:w="60" w:type="dxa"/>
-              <w:bottom w:w="100" w:type="dxa"/>
-              <w:right w:w="60" w:type="dxa"/>
-            </w:tcMar>
-            <w:vAlign w:val="center"/>
-          </w:tcPr>
-          <w:p>
-            <w:pPr>
-              <w:spacing w:line="269" w:lineRule="auto"/>
-              <w:jc w:val="left"/>
-              <w:rPr>
-                <w:rFonts w:ascii="SimSun" w:hAnsi="SimSun" w:cs="SimSun"/>
-                <w:color w:val="000000"/>
-                <w:sz w:val="18"/>
-                <w:szCs w:val="18"/>
-              </w:rPr>
-            </w:pPr>
-            <w:r>
-              <w:rPr>
-                <w:rFonts w:ascii="SimSun" w:hAnsi="SimSun" w:cs="SimSun" w:hint="eastAsia"/>
-                <w:color w:val="000000"/>
-                <w:sz w:val="18"/>
-                <w:szCs w:val="18"/>
-              </w:rPr>
-              <w:t>800,000</w:t>
-            </w:r>
-          </w:p>
-        </w:tc>
-      </w:tr>
-    </w:tbl>
-    <w:p>
-      <w:pPr>
-        <w:pStyle w:val="2"/>
-      </w:pPr>
-    </w:p>
-    <w:p>
-      <w:pPr>
-        <w:keepNext/>
-        <w:widowControl/>
-        <w:kinsoku w:val="0"/>
-        <w:autoSpaceDE w:val="0"/>
-        <w:autoSpaceDN w:val="0"/>
-        <w:adjustRightInd w:val="0"/>
-        <w:snapToGrid w:val="0"/>
-        <w:spacing w:before="120" w:line="360" w:lineRule="auto"/>
-        <w:jc w:val="left"/>
-        <w:textAlignment w:val="baseline"/>
-        <w:outlineLvl w:val="1"/>
-        <w:rPr>
-          <w:rFonts w:ascii="SimSun" w:hAnsi="SimSun" w:cs="SimSun"/>
-          <w:b/>
-          <w:snapToGrid w:val="0"/>
-          <w:color w:val="000000"/>
-          <w:sz w:val="28"/>
-          <w:szCs w:val="28"/>
-        </w:rPr>
-      </w:pPr>
-      <w:bookmarkStart w:id="26" w:name="_Toc900125"/>
-      <w:r>
-        <w:rPr>
-          <w:rFonts w:ascii="SimSun" w:hAnsi="SimSun" w:cs="SimSun" w:hint="eastAsia"/>
-          <w:b/>
-          <w:snapToGrid w:val="0"/>
-          <w:color w:val="000000"/>
-          <w:sz w:val="28"/>
-          <w:szCs w:val="28"/>
-        </w:rPr>
-        <w:t>5.2 硬件报价清单</w:t>
+        <w:t>5.1 硬件报价清单</w:t>
       </w:r>
       <w:bookmarkEnd w:id="26"/>
     </w:p>
@@ -7543,7 +7151,7 @@
                 <w:sz w:val="18"/>
                 <w:szCs w:val="18"/>
               </w:rPr>
-              <w:t>X300B工业搬运机器人，双轮差速驱动，激光SLAM导航，举升高度60 mm，导航到点精度&lt;±20 mm；含电池、自动回充桩、调度管理系统授权及现场建图调试</w:t>
+              <w:t>X300B工业搬运机器人，含电池、自动回充桩、调度管理系统授权及现场建图调试</w:t>
             </w:r>
           </w:p>
         </w:tc>
@@ -7814,7 +7422,7 @@
                 <w:sz w:val="18"/>
                 <w:szCs w:val="18"/>
               </w:rPr>
-              <w:t>运输机器人联动开门设备</w:t>
+              <w:t>运输机器人联动改造</w:t>
             </w:r>
           </w:p>
         </w:tc>
@@ -7847,7 +7455,7 @@
                 <w:sz w:val="18"/>
                 <w:szCs w:val="18"/>
               </w:rPr>
-              <w:t>运输路线上试验室门体的联网开门设备，含电动开门机、联网门控控制器（以太网接口，接收调度系统开门指令）、开门到位信号反馈及安装调试</w:t>
+              <w:t>运输路线试验室门体加装联动控制器与电动开门机</w:t>
             </w:r>
           </w:p>
         </w:tc>
@@ -7946,7 +7554,16 @@
                 <w:sz w:val="18"/>
                 <w:szCs w:val="18"/>
               </w:rPr>
-              <w:t>8,000</w:t>
+              <w:t>8</w:t>
+            </w:r>
+            <w:r>
+              <w:rPr>
+                <w:rFonts w:ascii="SimSun" w:hAnsi="SimSun" w:cs="SimSun" w:hint="eastAsia"/>
+                <w:color w:val="000000"/>
+                <w:sz w:val="18"/>
+                <w:szCs w:val="18"/>
+              </w:rPr>
+              <w:t>,000</w:t>
             </w:r>
           </w:p>
         </w:tc>
@@ -7979,7 +7596,16 @@
                 <w:sz w:val="18"/>
                 <w:szCs w:val="18"/>
               </w:rPr>
-              <w:t>64,000</w:t>
+              <w:t>32</w:t>
+            </w:r>
+            <w:r>
+              <w:rPr>
+                <w:rFonts w:ascii="SimSun" w:hAnsi="SimSun" w:cs="SimSun" w:hint="eastAsia"/>
+                <w:color w:val="000000"/>
+                <w:sz w:val="18"/>
+                <w:szCs w:val="18"/>
+              </w:rPr>
+              <w:t>,000</w:t>
             </w:r>
           </w:p>
         </w:tc>
@@ -8005,9 +7631,6 @@
                 <w:szCs w:val="18"/>
               </w:rPr>
             </w:pPr>
-            <w:r>
-              <w:t>含安装调试；门型与尺寸以现场勘察为准</w:t>
-            </w:r>
           </w:p>
         </w:tc>
       </w:tr>
@@ -8145,7 +7768,7 @@
                 <w:sz w:val="18"/>
                 <w:szCs w:val="18"/>
               </w:rPr>
-              <w:t>55英寸商用显示屏，用于滚动展示当日及次日试验任务</w:t>
+              <w:t>55英寸商用显示屏，含支架与安装</w:t>
             </w:r>
           </w:p>
         </w:tc>
@@ -8303,9 +7926,6 @@
                 <w:szCs w:val="18"/>
               </w:rPr>
             </w:pPr>
-            <w:r>
-              <w:t>含支架与安装</w:t>
-            </w:r>
           </w:p>
         </w:tc>
       </w:tr>
@@ -8409,7 +8029,25 @@
                 <w:sz w:val="18"/>
                 <w:szCs w:val="18"/>
               </w:rPr>
-              <w:t>边缘采集网关</w:t>
+              <w:t>采集</w:t>
+            </w:r>
+            <w:r>
+              <w:rPr>
+                <w:rFonts w:ascii="SimSun" w:hAnsi="SimSun" w:cs="SimSun" w:hint="eastAsia"/>
+                <w:color w:val="000000"/>
+                <w:sz w:val="18"/>
+                <w:szCs w:val="18"/>
+              </w:rPr>
+              <w:t>设备</w:t>
+            </w:r>
+            <w:r>
+              <w:rPr>
+                <w:rFonts w:ascii="SimSun" w:hAnsi="SimSun" w:cs="SimSun" w:hint="eastAsia"/>
+                <w:color w:val="000000"/>
+                <w:sz w:val="18"/>
+                <w:szCs w:val="18"/>
+              </w:rPr>
+              <w:t>与安装</w:t>
             </w:r>
           </w:p>
         </w:tc>
@@ -8442,7 +8080,34 @@
                 <w:sz w:val="18"/>
                 <w:szCs w:val="18"/>
               </w:rPr>
-              <w:t>支持RS232/RS485串口与以太网接口，用于采集试验设备通信数据</w:t>
+              <w:t>安装</w:t>
+            </w:r>
+            <w:r>
+              <w:rPr>
+                <w:rFonts w:ascii="SimSun" w:hAnsi="SimSun" w:cs="SimSun" w:hint="eastAsia"/>
+                <w:color w:val="000000"/>
+                <w:sz w:val="18"/>
+                <w:szCs w:val="18"/>
+              </w:rPr>
+              <w:t>采集试验设备</w:t>
+            </w:r>
+            <w:r>
+              <w:rPr>
+                <w:rFonts w:ascii="SimSun" w:hAnsi="SimSun" w:cs="SimSun" w:hint="eastAsia"/>
+                <w:color w:val="000000"/>
+                <w:sz w:val="18"/>
+                <w:szCs w:val="18"/>
+              </w:rPr>
+              <w:t>与采集程序用于数据</w:t>
+            </w:r>
+            <w:r>
+              <w:rPr>
+                <w:rFonts w:ascii="SimSun" w:hAnsi="SimSun" w:cs="SimSun" w:hint="eastAsia"/>
+                <w:color w:val="000000"/>
+                <w:sz w:val="18"/>
+                <w:szCs w:val="18"/>
+              </w:rPr>
+              <w:t>通信</w:t>
             </w:r>
           </w:p>
         </w:tc>
@@ -8508,7 +8173,7 @@
                 <w:sz w:val="18"/>
                 <w:szCs w:val="18"/>
               </w:rPr>
-              <w:t>4</w:t>
+              <w:t>8</w:t>
             </w:r>
           </w:p>
         </w:tc>
@@ -8541,7 +8206,16 @@
                 <w:sz w:val="18"/>
                 <w:szCs w:val="18"/>
               </w:rPr>
-              <w:t>3,000</w:t>
+              <w:t>5</w:t>
+            </w:r>
+            <w:r>
+              <w:rPr>
+                <w:rFonts w:ascii="SimSun" w:hAnsi="SimSun" w:cs="SimSun" w:hint="eastAsia"/>
+                <w:color w:val="000000"/>
+                <w:sz w:val="18"/>
+                <w:szCs w:val="18"/>
+              </w:rPr>
+              <w:t>,000</w:t>
             </w:r>
           </w:p>
         </w:tc>
@@ -8672,7 +8346,6 @@
                 <w:szCs w:val="18"/>
               </w:rPr>
             </w:pPr>
-            <w:r/>
           </w:p>
         </w:tc>
         <w:tc>
@@ -8697,7 +8370,6 @@
                 <w:szCs w:val="18"/>
               </w:rPr>
             </w:pPr>
-            <w:r/>
           </w:p>
         </w:tc>
         <w:tc>
@@ -8722,7 +8394,6 @@
                 <w:szCs w:val="18"/>
               </w:rPr>
             </w:pPr>
-            <w:r/>
           </w:p>
         </w:tc>
         <w:tc>
@@ -8747,7 +8418,6 @@
                 <w:szCs w:val="18"/>
               </w:rPr>
             </w:pPr>
-            <w:r/>
           </w:p>
         </w:tc>
         <w:tc>
@@ -8772,7 +8442,6 @@
                 <w:szCs w:val="18"/>
               </w:rPr>
             </w:pPr>
-            <w:r/>
           </w:p>
         </w:tc>
         <w:tc>
@@ -8797,7 +8466,6 @@
                 <w:szCs w:val="18"/>
               </w:rPr>
             </w:pPr>
-            <w:r/>
           </w:p>
         </w:tc>
         <w:tc>
@@ -8829,7 +8497,7 @@
                 <w:sz w:val="18"/>
                 <w:szCs w:val="18"/>
               </w:rPr>
-              <w:t>284,000</w:t>
+              <w:t>244,000</w:t>
             </w:r>
           </w:p>
         </w:tc>
@@ -8855,7 +8523,6 @@
                 <w:szCs w:val="18"/>
               </w:rPr>
             </w:pPr>
-            <w:r/>
           </w:p>
         </w:tc>
       </w:tr>
@@ -8905,7 +8572,7 @@
           <w:sz w:val="28"/>
           <w:szCs w:val="28"/>
         </w:rPr>
-        <w:t>5.3 软件报价清单</w:t>
+        <w:t>5.2 软件报价清单</w:t>
       </w:r>
       <w:bookmarkEnd w:id="28"/>
     </w:p>
@@ -9498,7 +9165,7 @@
                 <w:sz w:val="18"/>
                 <w:szCs w:val="18"/>
               </w:rPr>
-              <w:t>95,000</w:t>
+              <w:t>100,000</w:t>
             </w:r>
           </w:p>
         </w:tc>
@@ -9531,7 +9198,7 @@
                 <w:sz w:val="18"/>
                 <w:szCs w:val="18"/>
               </w:rPr>
-              <w:t>95,000</w:t>
+              <w:t>100,000</w:t>
             </w:r>
           </w:p>
         </w:tc>
@@ -9792,7 +9459,7 @@
                 <w:sz w:val="18"/>
                 <w:szCs w:val="18"/>
               </w:rPr>
-              <w:t>40,000</w:t>
+              <w:t>35,000</w:t>
             </w:r>
           </w:p>
         </w:tc>
@@ -9825,7 +9492,7 @@
                 <w:sz w:val="18"/>
                 <w:szCs w:val="18"/>
               </w:rPr>
-              <w:t>40,000</w:t>
+              <w:t>35,000</w:t>
             </w:r>
           </w:p>
         </w:tc>
@@ -10086,7 +9753,7 @@
                 <w:sz w:val="18"/>
                 <w:szCs w:val="18"/>
               </w:rPr>
-              <w:t>110,000</w:t>
+              <w:t>125,000</w:t>
             </w:r>
           </w:p>
         </w:tc>
@@ -10119,7 +9786,7 @@
                 <w:sz w:val="18"/>
                 <w:szCs w:val="18"/>
               </w:rPr>
-              <w:t>110,000</w:t>
+              <w:t>125,000</w:t>
             </w:r>
           </w:p>
         </w:tc>
@@ -10381,7 +10048,7 @@
                 <w:sz w:val="18"/>
                 <w:szCs w:val="18"/>
               </w:rPr>
-              <w:t>165,000</w:t>
+              <w:t>175,000</w:t>
             </w:r>
           </w:p>
         </w:tc>
@@ -10414,7 +10081,7 @@
                 <w:sz w:val="18"/>
                 <w:szCs w:val="18"/>
               </w:rPr>
-              <w:t>165,000</w:t>
+              <w:t>175,000</w:t>
             </w:r>
           </w:p>
         </w:tc>
@@ -10675,7 +10342,7 @@
                 <w:sz w:val="18"/>
                 <w:szCs w:val="18"/>
               </w:rPr>
-              <w:t>46,000</w:t>
+              <w:t>61,000</w:t>
             </w:r>
           </w:p>
         </w:tc>
@@ -10708,7 +10375,7 @@
                 <w:sz w:val="18"/>
                 <w:szCs w:val="18"/>
               </w:rPr>
-              <w:t>46,000</w:t>
+              <w:t>61,000</w:t>
             </w:r>
           </w:p>
         </w:tc>
@@ -11536,7 +11203,7 @@
                 <w:sz w:val="18"/>
                 <w:szCs w:val="18"/>
               </w:rPr>
-              <w:t>516,000</w:t>
+              <w:t>556,000</w:t>
             </w:r>
           </w:p>
         </w:tc>

</xml_diff>

<commit_message>
Pujiang: keep user's hardware wording, fix hardware arithmetic (312k), software 488k, summary table moved to the end; sync md and detailed quote
Co-Authored-By: Claude Sonnet 5.5 <noreply@anthropic.com>
Claude-Session: https://claude.ai/code/session_01DZcW8UzFAMq1wyGnVPG7By
</commit_message>
<xml_diff>
--- a/浦江/c-浦江网联试验室智能化提升项目（三期）建设方案 (1008).docx
+++ b/浦江/c-浦江网联试验室智能化提升项目（三期）建设方案 (1008).docx
@@ -1272,6 +1272,42 @@
             </w:r>
             <w:r>
               <w:instrText xml:space="preserve"> PAGEREF _Toc900126 \h </w:instrText>
+            </w:r>
+            <w:r>
+              <w:fldChar w:fldCharType="separate"/>
+            </w:r>
+            <w:r>
+              <w:t>15</w:t>
+            </w:r>
+            <w:r>
+              <w:fldChar w:fldCharType="end"/>
+            </w:r>
+          </w:hyperlink>
+        </w:p>
+        <w:p>
+          <w:pPr>
+            <w:pStyle w:val="TOC2"/>
+            <w:tabs>
+              <w:tab w:val="right" w:leader="dot" w:pos="8305"/>
+            </w:tabs>
+          </w:pPr>
+          <w:hyperlink w:anchor="_Toc900201" w:history="1">
+            <w:r>
+              <w:rPr>
+                <w:rFonts w:ascii="SimSun" w:hAnsi="SimSun" w:cs="SimSun" w:hint="eastAsia"/>
+                <w:snapToGrid w:val="0"/>
+                <w:szCs w:val="28"/>
+              </w:rPr>
+              <w:t>5.3 费用汇总</w:t>
+            </w:r>
+            <w:r>
+              <w:tab/>
+            </w:r>
+            <w:r>
+              <w:fldChar w:fldCharType="begin"/>
+            </w:r>
+            <w:r>
+              <w:instrText xml:space="preserve"> PAGEREF _Toc900201 \h </w:instrText>
             </w:r>
             <w:r>
               <w:fldChar w:fldCharType="separate"/>
@@ -7596,16 +7632,7 @@
                 <w:sz w:val="18"/>
                 <w:szCs w:val="18"/>
               </w:rPr>
-              <w:t>32</w:t>
-            </w:r>
-            <w:r>
-              <w:rPr>
-                <w:rFonts w:ascii="SimSun" w:hAnsi="SimSun" w:cs="SimSun" w:hint="eastAsia"/>
-                <w:color w:val="000000"/>
-                <w:sz w:val="18"/>
-                <w:szCs w:val="18"/>
-              </w:rPr>
-              <w:t>,000</w:t>
+              <w:t>64,000</w:t>
             </w:r>
           </w:p>
         </w:tc>
@@ -8248,7 +8275,7 @@
                 <w:sz w:val="18"/>
                 <w:szCs w:val="18"/>
               </w:rPr>
-              <w:t>12,000</w:t>
+              <w:t>40,000</w:t>
             </w:r>
           </w:p>
         </w:tc>
@@ -8497,7 +8524,7 @@
                 <w:sz w:val="18"/>
                 <w:szCs w:val="18"/>
               </w:rPr>
-              <w:t>244,000</w:t>
+              <w:t>312,000</w:t>
             </w:r>
           </w:p>
         </w:tc>
@@ -9165,7 +9192,7 @@
                 <w:sz w:val="18"/>
                 <w:szCs w:val="18"/>
               </w:rPr>
-              <w:t>100,000</w:t>
+              <w:t>90,000</w:t>
             </w:r>
           </w:p>
         </w:tc>
@@ -9198,7 +9225,7 @@
                 <w:sz w:val="18"/>
                 <w:szCs w:val="18"/>
               </w:rPr>
-              <w:t>100,000</w:t>
+              <w:t>90,000</w:t>
             </w:r>
           </w:p>
         </w:tc>
@@ -9753,7 +9780,7 @@
                 <w:sz w:val="18"/>
                 <w:szCs w:val="18"/>
               </w:rPr>
-              <w:t>125,000</w:t>
+              <w:t>100,000</w:t>
             </w:r>
           </w:p>
         </w:tc>
@@ -9786,7 +9813,7 @@
                 <w:sz w:val="18"/>
                 <w:szCs w:val="18"/>
               </w:rPr>
-              <w:t>125,000</w:t>
+              <w:t>100,000</w:t>
             </w:r>
           </w:p>
         </w:tc>
@@ -10048,7 +10075,7 @@
                 <w:sz w:val="18"/>
                 <w:szCs w:val="18"/>
               </w:rPr>
-              <w:t>175,000</w:t>
+              <w:t>160,000</w:t>
             </w:r>
           </w:p>
         </w:tc>
@@ -10081,7 +10108,7 @@
                 <w:sz w:val="18"/>
                 <w:szCs w:val="18"/>
               </w:rPr>
-              <w:t>175,000</w:t>
+              <w:t>160,000</w:t>
             </w:r>
           </w:p>
         </w:tc>
@@ -10342,7 +10369,7 @@
                 <w:sz w:val="18"/>
                 <w:szCs w:val="18"/>
               </w:rPr>
-              <w:t>61,000</w:t>
+              <w:t>43,000</w:t>
             </w:r>
           </w:p>
         </w:tc>
@@ -10375,7 +10402,7 @@
                 <w:sz w:val="18"/>
                 <w:szCs w:val="18"/>
               </w:rPr>
-              <w:t>61,000</w:t>
+              <w:t>43,000</w:t>
             </w:r>
           </w:p>
         </w:tc>
@@ -11203,7 +11230,7 @@
                 <w:sz w:val="18"/>
                 <w:szCs w:val="18"/>
               </w:rPr>
-              <w:t>556,000</w:t>
+              <w:t>488,000</w:t>
             </w:r>
           </w:p>
         </w:tc>
@@ -11238,6 +11265,357 @@
         <w:pStyle w:val="2"/>
       </w:pPr>
     </w:p>
+    <w:p>
+      <w:pPr>
+        <w:keepNext/>
+        <w:widowControl/>
+        <w:kinsoku w:val="0"/>
+        <w:autoSpaceDE w:val="0"/>
+        <w:autoSpaceDN w:val="0"/>
+        <w:adjustRightInd w:val="0"/>
+        <w:snapToGrid w:val="0"/>
+        <w:spacing w:before="120" w:line="360" w:lineRule="auto"/>
+        <w:jc w:val="left"/>
+        <w:textAlignment w:val="baseline"/>
+        <w:outlineLvl w:val="1"/>
+        <w:rPr>
+          <w:rFonts w:ascii="SimSun" w:hAnsi="SimSun" w:cs="SimSun"/>
+          <w:b/>
+          <w:snapToGrid w:val="0"/>
+          <w:color w:val="000000"/>
+          <w:sz w:val="28"/>
+          <w:szCs w:val="28"/>
+        </w:rPr>
+      </w:pPr>
+      <w:bookmarkStart w:id="9002" w:name="_Toc900201"/>
+      <w:r>
+        <w:rPr>
+          <w:rFonts w:ascii="SimSun" w:hAnsi="SimSun" w:cs="SimSun" w:hint="eastAsia"/>
+          <w:b/>
+          <w:snapToGrid w:val="0"/>
+          <w:color w:val="000000"/>
+          <w:sz w:val="28"/>
+          <w:szCs w:val="28"/>
+        </w:rPr>
+        <w:t>5.3 费用汇总</w:t>
+      </w:r>
+      <w:bookmarkEnd w:id="9002"/>
+    </w:p>
+    <w:tbl>
+      <w:tblPr>
+        <w:tblW w:w="8306" w:type="dxa"/>
+        <w:jc w:val="center"/>
+        <w:tblBorders>
+          <w:top w:val="single" w:sz="6" w:space="0" w:color="D9D9D9"/>
+          <w:left w:val="single" w:sz="6" w:space="0" w:color="D9D9D9"/>
+          <w:bottom w:val="single" w:sz="6" w:space="0" w:color="D9D9D9"/>
+          <w:right w:val="single" w:sz="6" w:space="0" w:color="D9D9D9"/>
+          <w:insideH w:val="single" w:sz="6" w:space="0" w:color="D9D9D9"/>
+          <w:insideV w:val="single" w:sz="6" w:space="0" w:color="D9D9D9"/>
+        </w:tblBorders>
+        <w:tblLayout w:type="fixed"/>
+        <w:tblLook w:val="04A0" w:firstRow="1" w:lastRow="0" w:firstColumn="1" w:lastColumn="0" w:noHBand="0" w:noVBand="1"/>
+      </w:tblPr>
+      <w:tblGrid>
+        <w:gridCol w:w="3986"/>
+        <w:gridCol w:w="4320"/>
+      </w:tblGrid>
+      <w:tr>
+        <w:trPr>
+          <w:cantSplit/>
+          <w:tblHeader/>
+          <w:jc w:val="center"/>
+        </w:trPr>
+        <w:tc>
+          <w:tcPr>
+            <w:tcW w:w="3986" w:type="dxa"/>
+            <w:shd w:val="clear" w:color="auto" w:fill="17365D"/>
+            <w:tcMar>
+              <w:top w:w="100" w:type="dxa"/>
+              <w:left w:w="60" w:type="dxa"/>
+              <w:bottom w:w="100" w:type="dxa"/>
+              <w:right w:w="60" w:type="dxa"/>
+            </w:tcMar>
+            <w:vAlign w:val="center"/>
+          </w:tcPr>
+          <w:p>
+            <w:pPr>
+              <w:spacing w:line="269" w:lineRule="auto"/>
+              <w:jc w:val="center"/>
+              <w:rPr>
+                <w:rFonts w:ascii="SimSun" w:hAnsi="SimSun" w:cs="SimSun"/>
+                <w:b/>
+                <w:color w:val="FFFFFF"/>
+                <w:sz w:val="18"/>
+                <w:szCs w:val="18"/>
+              </w:rPr>
+            </w:pPr>
+            <w:r>
+              <w:rPr>
+                <w:rFonts w:ascii="SimSun" w:hAnsi="SimSun" w:cs="SimSun" w:hint="eastAsia"/>
+                <w:b/>
+                <w:color w:val="FFFFFF"/>
+                <w:sz w:val="18"/>
+                <w:szCs w:val="18"/>
+              </w:rPr>
+              <w:t>项目</w:t>
+            </w:r>
+          </w:p>
+        </w:tc>
+        <w:tc>
+          <w:tcPr>
+            <w:tcW w:w="4320" w:type="dxa"/>
+            <w:shd w:val="clear" w:color="auto" w:fill="17365D"/>
+            <w:tcMar>
+              <w:top w:w="100" w:type="dxa"/>
+              <w:left w:w="60" w:type="dxa"/>
+              <w:bottom w:w="100" w:type="dxa"/>
+              <w:right w:w="60" w:type="dxa"/>
+            </w:tcMar>
+            <w:vAlign w:val="center"/>
+          </w:tcPr>
+          <w:p>
+            <w:pPr>
+              <w:spacing w:line="269" w:lineRule="auto"/>
+              <w:jc w:val="center"/>
+              <w:rPr>
+                <w:rFonts w:ascii="SimSun" w:hAnsi="SimSun" w:cs="SimSun"/>
+                <w:b/>
+                <w:color w:val="FFFFFF"/>
+                <w:sz w:val="18"/>
+                <w:szCs w:val="18"/>
+              </w:rPr>
+            </w:pPr>
+            <w:r>
+              <w:rPr>
+                <w:rFonts w:ascii="SimSun" w:hAnsi="SimSun" w:cs="SimSun" w:hint="eastAsia"/>
+                <w:b/>
+                <w:color w:val="FFFFFF"/>
+                <w:sz w:val="18"/>
+                <w:szCs w:val="18"/>
+              </w:rPr>
+              <w:t>金额（元）</w:t>
+            </w:r>
+          </w:p>
+        </w:tc>
+      </w:tr>
+      <w:tr>
+        <w:trPr>
+          <w:cantSplit/>
+          <w:jc w:val="center"/>
+        </w:trPr>
+        <w:tc>
+          <w:tcPr>
+            <w:tcW w:w="3986" w:type="dxa"/>
+            <w:tcMar>
+              <w:top w:w="100" w:type="dxa"/>
+              <w:left w:w="60" w:type="dxa"/>
+              <w:bottom w:w="100" w:type="dxa"/>
+              <w:right w:w="60" w:type="dxa"/>
+            </w:tcMar>
+            <w:vAlign w:val="center"/>
+          </w:tcPr>
+          <w:p>
+            <w:pPr>
+              <w:spacing w:line="269" w:lineRule="auto"/>
+              <w:jc w:val="center"/>
+              <w:rPr>
+                <w:rFonts w:ascii="SimSun" w:hAnsi="SimSun" w:cs="SimSun"/>
+                <w:color w:val="000000"/>
+                <w:sz w:val="18"/>
+                <w:szCs w:val="18"/>
+              </w:rPr>
+            </w:pPr>
+            <w:r>
+              <w:rPr>
+                <w:rFonts w:ascii="SimSun" w:hAnsi="SimSun" w:cs="SimSun" w:hint="eastAsia"/>
+                <w:color w:val="000000"/>
+                <w:sz w:val="18"/>
+                <w:szCs w:val="18"/>
+              </w:rPr>
+              <w:t>硬件总价</w:t>
+            </w:r>
+          </w:p>
+        </w:tc>
+        <w:tc>
+          <w:tcPr>
+            <w:tcW w:w="4320" w:type="dxa"/>
+            <w:tcMar>
+              <w:top w:w="100" w:type="dxa"/>
+              <w:left w:w="60" w:type="dxa"/>
+              <w:bottom w:w="100" w:type="dxa"/>
+              <w:right w:w="60" w:type="dxa"/>
+            </w:tcMar>
+            <w:vAlign w:val="center"/>
+          </w:tcPr>
+          <w:p>
+            <w:pPr>
+              <w:spacing w:line="269" w:lineRule="auto"/>
+              <w:jc w:val="left"/>
+              <w:rPr>
+                <w:rFonts w:ascii="SimSun" w:hAnsi="SimSun" w:cs="SimSun"/>
+                <w:color w:val="000000"/>
+                <w:sz w:val="18"/>
+                <w:szCs w:val="18"/>
+              </w:rPr>
+            </w:pPr>
+            <w:r>
+              <w:rPr>
+                <w:rFonts w:ascii="SimSun" w:hAnsi="SimSun" w:cs="SimSun" w:hint="eastAsia"/>
+                <w:color w:val="000000"/>
+                <w:sz w:val="18"/>
+                <w:szCs w:val="18"/>
+              </w:rPr>
+              <w:t>312,000</w:t>
+            </w:r>
+          </w:p>
+        </w:tc>
+      </w:tr>
+      <w:tr>
+        <w:trPr>
+          <w:cantSplit/>
+          <w:jc w:val="center"/>
+        </w:trPr>
+        <w:tc>
+          <w:tcPr>
+            <w:tcW w:w="3986" w:type="dxa"/>
+            <w:tcMar>
+              <w:top w:w="100" w:type="dxa"/>
+              <w:left w:w="60" w:type="dxa"/>
+              <w:bottom w:w="100" w:type="dxa"/>
+              <w:right w:w="60" w:type="dxa"/>
+            </w:tcMar>
+            <w:vAlign w:val="center"/>
+          </w:tcPr>
+          <w:p>
+            <w:pPr>
+              <w:spacing w:line="269" w:lineRule="auto"/>
+              <w:jc w:val="center"/>
+              <w:rPr>
+                <w:rFonts w:ascii="SimSun" w:hAnsi="SimSun" w:cs="SimSun"/>
+                <w:color w:val="000000"/>
+                <w:sz w:val="18"/>
+                <w:szCs w:val="18"/>
+              </w:rPr>
+            </w:pPr>
+            <w:r>
+              <w:rPr>
+                <w:rFonts w:ascii="SimSun" w:hAnsi="SimSun" w:cs="SimSun" w:hint="eastAsia"/>
+                <w:color w:val="000000"/>
+                <w:sz w:val="18"/>
+                <w:szCs w:val="18"/>
+              </w:rPr>
+              <w:t>软件总价</w:t>
+            </w:r>
+          </w:p>
+        </w:tc>
+        <w:tc>
+          <w:tcPr>
+            <w:tcW w:w="4320" w:type="dxa"/>
+            <w:tcMar>
+              <w:top w:w="100" w:type="dxa"/>
+              <w:left w:w="60" w:type="dxa"/>
+              <w:bottom w:w="100" w:type="dxa"/>
+              <w:right w:w="60" w:type="dxa"/>
+            </w:tcMar>
+            <w:vAlign w:val="center"/>
+          </w:tcPr>
+          <w:p>
+            <w:pPr>
+              <w:spacing w:line="269" w:lineRule="auto"/>
+              <w:jc w:val="left"/>
+              <w:rPr>
+                <w:rFonts w:ascii="SimSun" w:hAnsi="SimSun" w:cs="SimSun"/>
+                <w:color w:val="000000"/>
+                <w:sz w:val="18"/>
+                <w:szCs w:val="18"/>
+              </w:rPr>
+            </w:pPr>
+            <w:r>
+              <w:rPr>
+                <w:rFonts w:ascii="SimSun" w:hAnsi="SimSun" w:cs="SimSun" w:hint="eastAsia"/>
+                <w:color w:val="000000"/>
+                <w:sz w:val="18"/>
+                <w:szCs w:val="18"/>
+              </w:rPr>
+              <w:t>488,000</w:t>
+            </w:r>
+          </w:p>
+        </w:tc>
+      </w:tr>
+      <w:tr>
+        <w:trPr>
+          <w:cantSplit/>
+          <w:jc w:val="center"/>
+        </w:trPr>
+        <w:tc>
+          <w:tcPr>
+            <w:tcW w:w="3986" w:type="dxa"/>
+            <w:tcMar>
+              <w:top w:w="100" w:type="dxa"/>
+              <w:left w:w="60" w:type="dxa"/>
+              <w:bottom w:w="100" w:type="dxa"/>
+              <w:right w:w="60" w:type="dxa"/>
+            </w:tcMar>
+            <w:vAlign w:val="center"/>
+          </w:tcPr>
+          <w:p>
+            <w:pPr>
+              <w:spacing w:line="269" w:lineRule="auto"/>
+              <w:jc w:val="center"/>
+              <w:rPr>
+                <w:rFonts w:ascii="SimSun" w:hAnsi="SimSun" w:cs="SimSun"/>
+                <w:color w:val="000000"/>
+                <w:sz w:val="18"/>
+                <w:szCs w:val="18"/>
+              </w:rPr>
+            </w:pPr>
+            <w:r>
+              <w:rPr>
+                <w:rFonts w:ascii="SimSun" w:hAnsi="SimSun" w:cs="SimSun" w:hint="eastAsia"/>
+                <w:color w:val="000000"/>
+                <w:sz w:val="18"/>
+                <w:szCs w:val="18"/>
+              </w:rPr>
+              <w:t>合计</w:t>
+            </w:r>
+          </w:p>
+        </w:tc>
+        <w:tc>
+          <w:tcPr>
+            <w:tcW w:w="4320" w:type="dxa"/>
+            <w:tcMar>
+              <w:top w:w="100" w:type="dxa"/>
+              <w:left w:w="60" w:type="dxa"/>
+              <w:bottom w:w="100" w:type="dxa"/>
+              <w:right w:w="60" w:type="dxa"/>
+            </w:tcMar>
+            <w:vAlign w:val="center"/>
+          </w:tcPr>
+          <w:p>
+            <w:pPr>
+              <w:spacing w:line="269" w:lineRule="auto"/>
+              <w:jc w:val="left"/>
+              <w:rPr>
+                <w:rFonts w:ascii="SimSun" w:hAnsi="SimSun" w:cs="SimSun"/>
+                <w:color w:val="000000"/>
+                <w:sz w:val="18"/>
+                <w:szCs w:val="18"/>
+              </w:rPr>
+            </w:pPr>
+            <w:r>
+              <w:rPr>
+                <w:rFonts w:ascii="SimSun" w:hAnsi="SimSun" w:cs="SimSun" w:hint="eastAsia"/>
+                <w:color w:val="000000"/>
+                <w:sz w:val="18"/>
+                <w:szCs w:val="18"/>
+              </w:rPr>
+              <w:t>800,000</w:t>
+            </w:r>
+          </w:p>
+        </w:tc>
+      </w:tr>
+    </w:tbl>
     <w:p>
       <w:pPr>
         <w:spacing w:line="20" w:lineRule="exact"/>

</xml_diff>

<commit_message>
Pujiang plan: mini-program wording changed to App, cover resized to one page, page numbers start at project overview; sync md and quote
Co-Authored-By: Claude Sonnet 5.5 <noreply@anthropic.com>
Claude-Session: https://claude.ai/code/session_01DZcW8UzFAMq1wyGnVPG7By
</commit_message>
<xml_diff>
--- a/浦江/c-浦江网联试验室智能化提升项目（三期）建设方案 (1008).docx
+++ b/浦江/c-浦江网联试验室智能化提升项目（三期）建设方案 (1008).docx
@@ -143,67 +143,7 @@
     <w:p>
       <w:pPr>
         <w:pStyle w:val="20"/>
-        <w:ind w:firstLine="1044"/>
-        <w:rPr>
-          <w:rFonts w:ascii="黑体" w:eastAsia="黑体" w:hAnsi="黑体" w:cs="黑体"/>
-          <w:b/>
-          <w:sz w:val="52"/>
-          <w:szCs w:val="52"/>
-        </w:rPr>
-      </w:pPr>
-    </w:p>
-    <w:p>
-      <w:pPr>
-        <w:pStyle w:val="20"/>
-        <w:ind w:firstLine="1044"/>
-        <w:rPr>
-          <w:rFonts w:ascii="黑体" w:eastAsia="黑体" w:hAnsi="黑体" w:cs="黑体"/>
-          <w:b/>
-          <w:sz w:val="52"/>
-          <w:szCs w:val="52"/>
-        </w:rPr>
-      </w:pPr>
-    </w:p>
-    <w:p>
-      <w:pPr>
-        <w:pStyle w:val="20"/>
-        <w:ind w:firstLine="1044"/>
-        <w:rPr>
-          <w:rFonts w:ascii="黑体" w:eastAsia="黑体" w:hAnsi="黑体" w:cs="黑体"/>
-          <w:b/>
-          <w:sz w:val="52"/>
-          <w:szCs w:val="52"/>
-        </w:rPr>
-      </w:pPr>
-    </w:p>
-    <w:p>
-      <w:pPr>
-        <w:pStyle w:val="20"/>
         <w:ind w:firstLineChars="0" w:firstLine="0"/>
-        <w:rPr>
-          <w:rFonts w:ascii="黑体" w:eastAsia="黑体" w:hAnsi="黑体" w:cs="黑体"/>
-          <w:b/>
-          <w:sz w:val="52"/>
-          <w:szCs w:val="52"/>
-        </w:rPr>
-      </w:pPr>
-    </w:p>
-    <w:p>
-      <w:pPr>
-        <w:pStyle w:val="20"/>
-        <w:ind w:firstLine="1044"/>
-        <w:rPr>
-          <w:rFonts w:ascii="黑体" w:eastAsia="黑体" w:hAnsi="黑体" w:cs="黑体"/>
-          <w:b/>
-          <w:sz w:val="52"/>
-          <w:szCs w:val="52"/>
-        </w:rPr>
-      </w:pPr>
-    </w:p>
-    <w:p>
-      <w:pPr>
-        <w:pStyle w:val="20"/>
-        <w:ind w:firstLine="1044"/>
         <w:rPr>
           <w:rFonts w:ascii="黑体" w:eastAsia="黑体" w:hAnsi="黑体" w:cs="黑体"/>
           <w:b/>
@@ -220,22 +160,22 @@
         <w:autoSpaceDN w:val="0"/>
         <w:adjustRightInd w:val="0"/>
         <w:snapToGrid w:val="0"/>
-        <w:spacing w:before="58" w:line="480" w:lineRule="auto"/>
+        <w:spacing w:before="58" w:line="360" w:lineRule="auto"/>
         <w:jc w:val="center"/>
         <w:textAlignment w:val="baseline"/>
         <w:rPr>
           <w:rFonts w:ascii="黑体" w:eastAsia="黑体" w:hAnsi="黑体" w:cs="黑体"/>
           <w:bCs/>
-          <w:sz w:val="36"/>
-          <w:szCs w:val="36"/>
+          <w:sz w:val="28"/>
+          <w:szCs w:val="28"/>
         </w:rPr>
       </w:pPr>
       <w:r>
         <w:rPr>
           <w:rFonts w:ascii="黑体" w:eastAsia="黑体" w:hAnsi="黑体" w:cs="黑体" w:hint="eastAsia"/>
           <w:bCs/>
-          <w:sz w:val="36"/>
-          <w:szCs w:val="36"/>
+          <w:sz w:val="28"/>
+          <w:szCs w:val="28"/>
         </w:rPr>
         <w:t>江苏正方交通科技有限公司</w:t>
       </w:r>
@@ -248,15 +188,15 @@
         <w:autoSpaceDN w:val="0"/>
         <w:adjustRightInd w:val="0"/>
         <w:snapToGrid w:val="0"/>
-        <w:spacing w:line="480" w:lineRule="auto"/>
+        <w:spacing w:line="360" w:lineRule="auto"/>
         <w:jc w:val="center"/>
         <w:textAlignment w:val="baseline"/>
         <w:rPr>
           <w:rFonts w:ascii="黑体" w:eastAsia="黑体" w:hAnsi="黑体" w:cs="黑体"/>
           <w:bCs/>
           <w:kern w:val="2"/>
-          <w:sz w:val="36"/>
-          <w:szCs w:val="36"/>
+          <w:sz w:val="28"/>
+          <w:szCs w:val="28"/>
         </w:rPr>
         <w:sectPr>
           <w:headerReference w:type="default" r:id="rId7"/>
@@ -271,10 +211,10 @@
           <w:rFonts w:ascii="黑体" w:eastAsia="黑体" w:hAnsi="黑体" w:cs="黑体" w:hint="eastAsia"/>
           <w:bCs/>
           <w:kern w:val="2"/>
-          <w:sz w:val="36"/>
-          <w:szCs w:val="36"/>
-        </w:rPr>
-        <w:t>2026年10</w:t>
+          <w:sz w:val="28"/>
+          <w:szCs w:val="28"/>
+        </w:rPr>
+        <w:t>2026年10月</w:t>
       </w:r>
     </w:p>
     <w:bookmarkEnd w:id="1" w:displacedByCustomXml="next"/>
@@ -341,7 +281,7 @@
               <w:fldChar w:fldCharType="separate"/>
             </w:r>
             <w:r>
-              <w:t>4</w:t>
+              <w:t>1</w:t>
             </w:r>
             <w:r>
               <w:fldChar w:fldCharType="end"/>
@@ -377,7 +317,7 @@
               <w:fldChar w:fldCharType="separate"/>
             </w:r>
             <w:r>
-              <w:t>4</w:t>
+              <w:t>1</w:t>
             </w:r>
             <w:r>
               <w:fldChar w:fldCharType="end"/>
@@ -413,7 +353,7 @@
               <w:fldChar w:fldCharType="separate"/>
             </w:r>
             <w:r>
-              <w:t>4</w:t>
+              <w:t>1</w:t>
             </w:r>
             <w:r>
               <w:fldChar w:fldCharType="end"/>
@@ -449,7 +389,7 @@
               <w:fldChar w:fldCharType="separate"/>
             </w:r>
             <w:r>
-              <w:t>5</w:t>
+              <w:t>2</w:t>
             </w:r>
             <w:r>
               <w:fldChar w:fldCharType="end"/>
@@ -485,7 +425,7 @@
               <w:fldChar w:fldCharType="separate"/>
             </w:r>
             <w:r>
-              <w:t>6</w:t>
+              <w:t>3</w:t>
             </w:r>
             <w:r>
               <w:fldChar w:fldCharType="end"/>
@@ -521,7 +461,7 @@
               <w:fldChar w:fldCharType="separate"/>
             </w:r>
             <w:r>
-              <w:t>6</w:t>
+              <w:t>3</w:t>
             </w:r>
             <w:r>
               <w:fldChar w:fldCharType="end"/>
@@ -557,7 +497,7 @@
               <w:fldChar w:fldCharType="separate"/>
             </w:r>
             <w:r>
-              <w:t>6</w:t>
+              <w:t>3</w:t>
             </w:r>
             <w:r>
               <w:fldChar w:fldCharType="end"/>
@@ -593,7 +533,7 @@
               <w:fldChar w:fldCharType="separate"/>
             </w:r>
             <w:r>
-              <w:t>7</w:t>
+              <w:t>4</w:t>
             </w:r>
             <w:r>
               <w:fldChar w:fldCharType="end"/>
@@ -629,7 +569,7 @@
               <w:fldChar w:fldCharType="separate"/>
             </w:r>
             <w:r>
-              <w:t>8</w:t>
+              <w:t>6</w:t>
             </w:r>
             <w:r>
               <w:fldChar w:fldCharType="end"/>
@@ -665,7 +605,7 @@
               <w:fldChar w:fldCharType="separate"/>
             </w:r>
             <w:r>
-              <w:t>8</w:t>
+              <w:t>6</w:t>
             </w:r>
             <w:r>
               <w:fldChar w:fldCharType="end"/>
@@ -701,7 +641,7 @@
               <w:fldChar w:fldCharType="separate"/>
             </w:r>
             <w:r>
-              <w:t>8</w:t>
+              <w:t>7</w:t>
             </w:r>
             <w:r>
               <w:fldChar w:fldCharType="end"/>
@@ -737,7 +677,7 @@
               <w:fldChar w:fldCharType="separate"/>
             </w:r>
             <w:r>
-              <w:t>9</w:t>
+              <w:t>7</w:t>
             </w:r>
             <w:r>
               <w:fldChar w:fldCharType="end"/>
@@ -773,7 +713,7 @@
               <w:fldChar w:fldCharType="separate"/>
             </w:r>
             <w:r>
-              <w:t>9</w:t>
+              <w:t>7</w:t>
             </w:r>
             <w:r>
               <w:fldChar w:fldCharType="end"/>
@@ -809,7 +749,7 @@
               <w:fldChar w:fldCharType="separate"/>
             </w:r>
             <w:r>
-              <w:t>10</w:t>
+              <w:t>8</w:t>
             </w:r>
             <w:r>
               <w:fldChar w:fldCharType="end"/>
@@ -845,7 +785,7 @@
               <w:fldChar w:fldCharType="separate"/>
             </w:r>
             <w:r>
-              <w:t>10</w:t>
+              <w:t>9</w:t>
             </w:r>
             <w:r>
               <w:fldChar w:fldCharType="end"/>
@@ -881,7 +821,7 @@
               <w:fldChar w:fldCharType="separate"/>
             </w:r>
             <w:r>
-              <w:t>11</w:t>
+              <w:t>10</w:t>
             </w:r>
             <w:r>
               <w:fldChar w:fldCharType="end"/>
@@ -917,7 +857,7 @@
               <w:fldChar w:fldCharType="separate"/>
             </w:r>
             <w:r>
-              <w:t>12</w:t>
+              <w:t>11</w:t>
             </w:r>
             <w:r>
               <w:fldChar w:fldCharType="end"/>
@@ -953,7 +893,7 @@
               <w:fldChar w:fldCharType="separate"/>
             </w:r>
             <w:r>
-              <w:t>12</w:t>
+              <w:t>11</w:t>
             </w:r>
             <w:r>
               <w:fldChar w:fldCharType="end"/>
@@ -989,7 +929,7 @@
               <w:fldChar w:fldCharType="separate"/>
             </w:r>
             <w:r>
-              <w:t>13</w:t>
+              <w:t>12</w:t>
             </w:r>
             <w:r>
               <w:fldChar w:fldCharType="end"/>
@@ -1025,7 +965,7 @@
               <w:fldChar w:fldCharType="separate"/>
             </w:r>
             <w:r>
-              <w:t>13</w:t>
+              <w:t>12</w:t>
             </w:r>
             <w:r>
               <w:fldChar w:fldCharType="end"/>
@@ -1061,7 +1001,7 @@
               <w:fldChar w:fldCharType="separate"/>
             </w:r>
             <w:r>
-              <w:t>13</w:t>
+              <w:t>12</w:t>
             </w:r>
             <w:r>
               <w:fldChar w:fldCharType="end"/>
@@ -1097,7 +1037,7 @@
               <w:fldChar w:fldCharType="separate"/>
             </w:r>
             <w:r>
-              <w:t>14</w:t>
+              <w:t>13</w:t>
             </w:r>
             <w:r>
               <w:fldChar w:fldCharType="end"/>
@@ -1133,43 +1073,7 @@
               <w:fldChar w:fldCharType="separate"/>
             </w:r>
             <w:r>
-              <w:t>14</w:t>
-            </w:r>
-            <w:r>
-              <w:fldChar w:fldCharType="end"/>
-            </w:r>
-          </w:hyperlink>
-        </w:p>
-        <w:p>
-          <w:pPr>
-            <w:pStyle w:val="TOC2"/>
-            <w:tabs>
-              <w:tab w:val="right" w:leader="dot" w:pos="8305"/>
-            </w:tabs>
-          </w:pPr>
-          <w:hyperlink w:anchor="_Toc900123" w:history="1">
-            <w:r>
-              <w:rPr>
-                <w:rFonts w:ascii="SimSun" w:hAnsi="SimSun" w:cs="SimSun" w:hint="eastAsia"/>
-                <w:snapToGrid w:val="0"/>
-                <w:szCs w:val="28"/>
-              </w:rPr>
-              <w:t>4.2 验收指标</w:t>
-            </w:r>
-            <w:r>
-              <w:tab/>
-            </w:r>
-            <w:r>
-              <w:fldChar w:fldCharType="begin"/>
-            </w:r>
-            <w:r>
-              <w:instrText xml:space="preserve"> PAGEREF _Toc900123 \h </w:instrText>
-            </w:r>
-            <w:r>
-              <w:fldChar w:fldCharType="separate"/>
-            </w:r>
-            <w:r>
-              <w:t>14</w:t>
+              <w:t>13</w:t>
             </w:r>
             <w:r>
               <w:fldChar w:fldCharType="end"/>
@@ -1205,7 +1109,7 @@
               <w:fldChar w:fldCharType="separate"/>
             </w:r>
             <w:r>
-              <w:t>15</w:t>
+              <w:t>14</w:t>
             </w:r>
             <w:r>
               <w:fldChar w:fldCharType="end"/>
@@ -1241,7 +1145,7 @@
               <w:fldChar w:fldCharType="separate"/>
             </w:r>
             <w:r>
-              <w:t>15</w:t>
+              <w:t>14</w:t>
             </w:r>
             <w:r>
               <w:fldChar w:fldCharType="end"/>
@@ -1277,7 +1181,7 @@
               <w:fldChar w:fldCharType="separate"/>
             </w:r>
             <w:r>
-              <w:t>15</w:t>
+              <w:t>14</w:t>
             </w:r>
             <w:r>
               <w:fldChar w:fldCharType="end"/>
@@ -2654,7 +2558,7 @@
           <w:sz w:val="24"/>
           <w:szCs w:val="24"/>
         </w:rPr>
-        <w:t>感知层由拍照终端、试验仪器、边缘采集网关、搬运机器人与智能门禁组成，负责数据采集与实物运行；网络层提供试验室局域网与无线网络覆盖；平台层以智慧试验室平台为核心，在既有系统的基础上建设业务数据中枢，并升级“小浦”智能体；应用层承载委托受理、任务调度、试验数据采集与报告生成等业务应用；交互展示层面向试验人员与管理人员提供小程序、引导屏、信息屏及桌面端等访问方式。</w:t>
+        <w:t>感知层由拍照终端、试验仪器、边缘采集网关、搬运机器人与智能门禁组成，负责数据采集与实物运行；网络层提供试验室局域网与无线网络覆盖；平台层以智慧试验室平台为核心，在既有系统的基础上建设业务数据中枢，并升级“小浦”智能体；应用层承载委托受理、任务调度、试验数据采集与报告生成等业务应用；交互展示层面向试验人员与管理人员提供App、引导屏、信息屏及桌面端等访问方式。</w:t>
       </w:r>
     </w:p>
     <w:p>
@@ -2981,7 +2885,7 @@
           <w:sz w:val="24"/>
           <w:szCs w:val="24"/>
         </w:rPr>
-        <w:t>在委托前台设置预委托二维码，客户通过微信小程序填报委托单位、工程名称、检测项目、样品信息及联系人等内容，系统依据客户的历史委托记录自动填充重复性信息。客户也可拍摄纸质委托单，由“小浦”识别单据内容并预填表单。预委托数据经委托前台人员核验后转为正式委托，委托信息的采集环节由此前移至客户到达之前，委托前台的现场工作由信息录入转为信息核验。</w:t>
+        <w:t>在委托前台设置预委托二维码，客户通过App填报委托单位、工程名称、检测项目、样品信息及联系人等内容，系统依据客户的历史委托记录自动填充重复性信息。客户也可拍摄纸质委托单，由“小浦”识别单据内容并预填表单。预委托数据经委托前台人员核验后转为正式委托，委托信息的采集环节由此前移至客户到达之前，委托前台的现场工作由信息录入转为信息核验。</w:t>
       </w:r>
     </w:p>
     <w:p>
@@ -3129,7 +3033,7 @@
           <w:sz w:val="24"/>
           <w:szCs w:val="24"/>
         </w:rPr>
-        <w:t>小程序可</w:t>
+        <w:t>App</w:t>
       </w:r>
       <w:r>
         <w:rPr>
@@ -3189,7 +3093,7 @@
           <w:sz w:val="24"/>
           <w:szCs w:val="24"/>
         </w:rPr>
-        <w:t>APP</w:t>
+        <w:t>App</w:t>
       </w:r>
       <w:r>
         <w:rPr>
@@ -11625,8 +11529,10 @@
       </w:pPr>
     </w:p>
     <w:sectPr>
+      <w:footerReference w:type="default" r:id="rId40"/>
       <w:pgSz w:w="11905" w:h="16840"/>
       <w:pgMar w:top="1440" w:right="1800" w:bottom="1440" w:left="1800" w:header="720" w:footer="720" w:gutter="0"/>
+      <w:pgNumType w:start="1"/>
       <w:cols w:space="720"/>
     </w:sectPr>
   </w:body>
@@ -11650,6 +11556,47 @@
     </w:p>
   </w:endnote>
 </w:endnotes>
+</file>
+
+<file path=word/footer1.xml><?xml version="1.0" encoding="utf-8"?>
+<w:ftr xmlns:w="http://schemas.openxmlformats.org/wordprocessingml/2006/main" xmlns:r="http://schemas.openxmlformats.org/officeDocument/2006/relationships">
+  <w:p>
+    <w:pPr>
+      <w:jc w:val="center"/>
+    </w:pPr>
+    <w:r>
+      <w:rPr>
+        <w:rFonts w:ascii="宋体" w:eastAsia="宋体" w:hAnsi="宋体" w:hint="eastAsia"/>
+        <w:sz w:val="21"/>
+      </w:rPr>
+      <w:fldChar w:fldCharType="begin"/>
+    </w:r>
+    <w:r>
+      <w:rPr>
+        <w:sz w:val="21"/>
+      </w:rPr>
+      <w:instrText xml:space="preserve"> PAGE </w:instrText>
+    </w:r>
+    <w:r>
+      <w:rPr>
+        <w:sz w:val="21"/>
+      </w:rPr>
+      <w:fldChar w:fldCharType="separate"/>
+    </w:r>
+    <w:r>
+      <w:rPr>
+        <w:sz w:val="21"/>
+      </w:rPr>
+      <w:t>1</w:t>
+    </w:r>
+    <w:r>
+      <w:rPr>
+        <w:sz w:val="21"/>
+      </w:rPr>
+      <w:fldChar w:fldCharType="end"/>
+    </w:r>
+  </w:p>
+</w:ftr>
 </file>
 
 <file path=word/footnotes.xml><?xml version="1.0" encoding="utf-8"?>

</xml_diff>